<commit_message>
adds additional updating details
</commit_message>
<xml_diff>
--- a/Instructions_UpdatingFiles_EachYear.docx
+++ b/Instructions_UpdatingFiles_EachYear.docx
@@ -23,8 +23,77 @@
         <w:ind w:left="720" w:hanging="360"/>
       </w:pPr>
       <w:r>
-        <w:t>Have R. Have a GitHub Account. Connect to R Project on GitHub and Pull Files for Fiscal-Futures-Topics.</w:t>
-      </w:r>
+        <w:t xml:space="preserve">Have R. </w:t>
+      </w:r>
+    </w:p>
+    <w:p>
+      <w:pPr>
+        <w:ind w:left="720" w:hanging="360"/>
+      </w:pPr>
+      <w:r>
+        <w:t xml:space="preserve">Have a GitHub Account. </w:t>
+      </w:r>
+    </w:p>
+    <w:p>
+      <w:pPr>
+        <w:ind w:left="720" w:hanging="360"/>
+      </w:pPr>
+      <w:r>
+        <w:t>Connect to GitHub</w:t>
+      </w:r>
+      <w:r>
+        <w:t xml:space="preserve"> </w:t>
+      </w:r>
+      <w:r>
+        <w:t>with SSH</w:t>
+      </w:r>
+    </w:p>
+    <w:p>
+      <w:pPr>
+        <w:pStyle w:val="ListParagraph"/>
+        <w:numPr>
+          <w:ilvl w:val="0"/>
+          <w:numId w:val="2"/>
+        </w:numPr>
+      </w:pPr>
+      <w:r>
+        <w:t>Get ssh key</w:t>
+      </w:r>
+    </w:p>
+    <w:p>
+      <w:r>
+        <w:t xml:space="preserve">Ls -/.ssh    </w:t>
+      </w:r>
+      <w:r>
+        <w:sym w:font="Wingdings" w:char="F0DF"/>
+      </w:r>
+      <w:r>
+        <w:t xml:space="preserve"> tells you if you have SSH key. </w:t>
+      </w:r>
+    </w:p>
+    <w:p>
+      <w:r>
+        <w:t>Add more steps here later</w:t>
+      </w:r>
+    </w:p>
+    <w:p/>
+    <w:p>
+      <w:pPr>
+        <w:ind w:left="720" w:hanging="360"/>
+      </w:pPr>
+      <w:r>
+        <w:t>Pull Files for Fiscal-Futures-Topics.</w:t>
+      </w:r>
+    </w:p>
+    <w:p>
+      <w:pPr>
+        <w:ind w:left="720" w:hanging="360"/>
+      </w:pPr>
+    </w:p>
+    <w:p>
+      <w:pPr>
+        <w:ind w:left="720" w:hanging="360"/>
+      </w:pPr>
     </w:p>
     <w:p>
       <w:pPr>
@@ -50,6 +119,9 @@
       <w:r>
         <w:t>/ expenditures or the revenues folder</w:t>
       </w:r>
+      <w:r>
+        <w:t>.</w:t>
+      </w:r>
     </w:p>
     <w:p>
       <w:pPr>
@@ -131,7 +203,35 @@
       </w:r>
       <w:proofErr w:type="spellEnd"/>
       <w:r>
-        <w:t xml:space="preserve"> in Fiscal-Futures-Topics R project. </w:t>
+        <w:t xml:space="preserve"> in Fiscal-Futures-Topics R project.</w:t>
+      </w:r>
+      <w:r>
+        <w:t xml:space="preserve"> NOTE you need to manually run the chunks. They are set to EVAL == FALSE. </w:t>
+      </w:r>
+      <w:r>
+        <w:t xml:space="preserve"> </w:t>
+      </w:r>
+      <w:r>
+        <w:t>There is one chunk called “</w:t>
+      </w:r>
+      <w:r>
+        <w:t>historic-create-rev-csv-</w:t>
+      </w:r>
+      <w:proofErr w:type="spellStart"/>
+      <w:r>
+        <w:t>dtafiles</w:t>
+      </w:r>
+      <w:proofErr w:type="spellEnd"/>
+      <w:r>
+        <w:t xml:space="preserve">” that you do not need to run. It is for </w:t>
+      </w:r>
+      <w:proofErr w:type="gramStart"/>
+      <w:r>
+        <w:t>historic</w:t>
+      </w:r>
+      <w:proofErr w:type="gramEnd"/>
+      <w:r>
+        <w:t xml:space="preserve"> documentation only. </w:t>
       </w:r>
     </w:p>
     <w:p>
@@ -191,7 +291,15 @@
         <w:t>d</w:t>
       </w:r>
       <w:r>
-        <w:t xml:space="preserve"> new and reused funds, agencies, organizations, etc. anything that has changed from previous fiscal years.</w:t>
+        <w:t xml:space="preserve"> new and reused funds, agencies, organizations, etc.</w:t>
+      </w:r>
+      <w:proofErr w:type="gramStart"/>
+      <w:r>
+        <w:t xml:space="preserve"> anything</w:t>
+      </w:r>
+      <w:proofErr w:type="gramEnd"/>
+      <w:r>
+        <w:t xml:space="preserve"> that has changed from previous fiscal years.</w:t>
       </w:r>
     </w:p>
     <w:p>
@@ -203,7 +311,15 @@
         </w:numPr>
       </w:pPr>
       <w:r>
-        <w:t xml:space="preserve">Make a document or show the research team somehow the new funds or revenue sources so that decisions can be made on if they should be included in the fiscal gap or not. </w:t>
+        <w:t xml:space="preserve">Make a document or show the research team somehow the new funds or revenue sources so that decisions can be made on </w:t>
+      </w:r>
+      <w:proofErr w:type="gramStart"/>
+      <w:r>
+        <w:t>if</w:t>
+      </w:r>
+      <w:proofErr w:type="gramEnd"/>
+      <w:r>
+        <w:t xml:space="preserve"> they should be included in the fiscal gap or not. </w:t>
       </w:r>
     </w:p>
     <w:p>
@@ -214,8 +330,14 @@
           <w:numId w:val="1"/>
         </w:numPr>
       </w:pPr>
-      <w:r>
-        <w:t>Usually a table of the output from code-</w:t>
+      <w:proofErr w:type="gramStart"/>
+      <w:r>
+        <w:lastRenderedPageBreak/>
+        <w:t>Usually</w:t>
+      </w:r>
+      <w:proofErr w:type="gramEnd"/>
+      <w:r>
+        <w:t xml:space="preserve"> a table of the output from code-</w:t>
       </w:r>
       <w:proofErr w:type="spellStart"/>
       <w:r>
@@ -223,7 +345,23 @@
       </w:r>
       <w:proofErr w:type="spellEnd"/>
       <w:r>
-        <w:t xml:space="preserve"> is screenshotted or shown somehow to the group and the RA searches what the funds are supposed to be used for. Add column for if it is a name change, not new, new. Etc. Identify what rev source group it should be included as. See past examples if confused!</w:t>
+        <w:t xml:space="preserve"> is screenshotted or shown somehow to the group and the RA searches what the funds are supposed to be used for. Add column for if it is a name change, not new, new. Etc. Identify what rev source group it should be included </w:t>
+      </w:r>
+      <w:proofErr w:type="gramStart"/>
+      <w:r>
+        <w:t>as</w:t>
+      </w:r>
+      <w:proofErr w:type="gramEnd"/>
+      <w:r>
+        <w:t xml:space="preserve">. See past examples </w:t>
+      </w:r>
+      <w:proofErr w:type="gramStart"/>
+      <w:r>
+        <w:t>if</w:t>
+      </w:r>
+      <w:proofErr w:type="gramEnd"/>
+      <w:r>
+        <w:t xml:space="preserve"> confused!</w:t>
       </w:r>
     </w:p>
     <w:p>
@@ -234,6 +372,9 @@
           <w:numId w:val="1"/>
         </w:numPr>
       </w:pPr>
+      <w:r>
+        <w:t>Search each fund to see if name is changed or if the fund has a completely new name</w:t>
+      </w:r>
     </w:p>
     <w:p>
       <w:pPr>
@@ -253,6 +394,9 @@
       </w:pPr>
       <w:r>
         <w:t>After new and reused funds are discussed with research group, update input files.</w:t>
+      </w:r>
+      <w:r>
+        <w:t xml:space="preserve"> Determine if included or excluded in fiscal gap calculation.</w:t>
       </w:r>
     </w:p>
     <w:p>
@@ -408,8 +552,123 @@
       </w:pPr>
     </w:lvl>
   </w:abstractNum>
+  <w:abstractNum w:abstractNumId="1" w15:restartNumberingAfterBreak="0">
+    <w:nsid w:val="134D1499"/>
+    <w:multiLevelType w:val="hybridMultilevel"/>
+    <w:tmpl w:val="C8285E18"/>
+    <w:lvl w:ilvl="0" w:tplc="AC1C5470">
+      <w:numFmt w:val="bullet"/>
+      <w:lvlText w:val="-"/>
+      <w:lvlJc w:val="left"/>
+      <w:pPr>
+        <w:ind w:left="1080" w:hanging="360"/>
+      </w:pPr>
+      <w:rPr>
+        <w:rFonts w:ascii="Times New Roman" w:eastAsiaTheme="minorHAnsi" w:hAnsi="Times New Roman" w:cs="Times New Roman" w:hint="default"/>
+      </w:rPr>
+    </w:lvl>
+    <w:lvl w:ilvl="1" w:tplc="04090003" w:tentative="1">
+      <w:start w:val="1"/>
+      <w:numFmt w:val="bullet"/>
+      <w:lvlText w:val="o"/>
+      <w:lvlJc w:val="left"/>
+      <w:pPr>
+        <w:ind w:left="1800" w:hanging="360"/>
+      </w:pPr>
+      <w:rPr>
+        <w:rFonts w:ascii="Courier New" w:hAnsi="Courier New" w:cs="Courier New" w:hint="default"/>
+      </w:rPr>
+    </w:lvl>
+    <w:lvl w:ilvl="2" w:tplc="04090005" w:tentative="1">
+      <w:start w:val="1"/>
+      <w:numFmt w:val="bullet"/>
+      <w:lvlText w:val=""/>
+      <w:lvlJc w:val="left"/>
+      <w:pPr>
+        <w:ind w:left="2520" w:hanging="360"/>
+      </w:pPr>
+      <w:rPr>
+        <w:rFonts w:ascii="Wingdings" w:hAnsi="Wingdings" w:hint="default"/>
+      </w:rPr>
+    </w:lvl>
+    <w:lvl w:ilvl="3" w:tplc="04090001" w:tentative="1">
+      <w:start w:val="1"/>
+      <w:numFmt w:val="bullet"/>
+      <w:lvlText w:val=""/>
+      <w:lvlJc w:val="left"/>
+      <w:pPr>
+        <w:ind w:left="3240" w:hanging="360"/>
+      </w:pPr>
+      <w:rPr>
+        <w:rFonts w:ascii="Symbol" w:hAnsi="Symbol" w:hint="default"/>
+      </w:rPr>
+    </w:lvl>
+    <w:lvl w:ilvl="4" w:tplc="04090003" w:tentative="1">
+      <w:start w:val="1"/>
+      <w:numFmt w:val="bullet"/>
+      <w:lvlText w:val="o"/>
+      <w:lvlJc w:val="left"/>
+      <w:pPr>
+        <w:ind w:left="3960" w:hanging="360"/>
+      </w:pPr>
+      <w:rPr>
+        <w:rFonts w:ascii="Courier New" w:hAnsi="Courier New" w:cs="Courier New" w:hint="default"/>
+      </w:rPr>
+    </w:lvl>
+    <w:lvl w:ilvl="5" w:tplc="04090005" w:tentative="1">
+      <w:start w:val="1"/>
+      <w:numFmt w:val="bullet"/>
+      <w:lvlText w:val=""/>
+      <w:lvlJc w:val="left"/>
+      <w:pPr>
+        <w:ind w:left="4680" w:hanging="360"/>
+      </w:pPr>
+      <w:rPr>
+        <w:rFonts w:ascii="Wingdings" w:hAnsi="Wingdings" w:hint="default"/>
+      </w:rPr>
+    </w:lvl>
+    <w:lvl w:ilvl="6" w:tplc="04090001" w:tentative="1">
+      <w:start w:val="1"/>
+      <w:numFmt w:val="bullet"/>
+      <w:lvlText w:val=""/>
+      <w:lvlJc w:val="left"/>
+      <w:pPr>
+        <w:ind w:left="5400" w:hanging="360"/>
+      </w:pPr>
+      <w:rPr>
+        <w:rFonts w:ascii="Symbol" w:hAnsi="Symbol" w:hint="default"/>
+      </w:rPr>
+    </w:lvl>
+    <w:lvl w:ilvl="7" w:tplc="04090003" w:tentative="1">
+      <w:start w:val="1"/>
+      <w:numFmt w:val="bullet"/>
+      <w:lvlText w:val="o"/>
+      <w:lvlJc w:val="left"/>
+      <w:pPr>
+        <w:ind w:left="6120" w:hanging="360"/>
+      </w:pPr>
+      <w:rPr>
+        <w:rFonts w:ascii="Courier New" w:hAnsi="Courier New" w:cs="Courier New" w:hint="default"/>
+      </w:rPr>
+    </w:lvl>
+    <w:lvl w:ilvl="8" w:tplc="04090005" w:tentative="1">
+      <w:start w:val="1"/>
+      <w:numFmt w:val="bullet"/>
+      <w:lvlText w:val=""/>
+      <w:lvlJc w:val="left"/>
+      <w:pPr>
+        <w:ind w:left="6840" w:hanging="360"/>
+      </w:pPr>
+      <w:rPr>
+        <w:rFonts w:ascii="Wingdings" w:hAnsi="Wingdings" w:hint="default"/>
+      </w:rPr>
+    </w:lvl>
+  </w:abstractNum>
   <w:num w:numId="1" w16cid:durableId="1958828968">
     <w:abstractNumId w:val="0"/>
+  </w:num>
+  <w:num w:numId="2" w16cid:durableId="832140988">
+    <w:abstractNumId w:val="1"/>
   </w:num>
 </w:numbering>
 </file>

</xml_diff>